<commit_message>
Official-data evaluation, metrics, filled submission deck and disclosure form
- results.jsonl and metrics.md measured on the official data (live Groq model, real HTTP)
- Stress test on official cache hits; renderer handles official-data sections and run conditions
- README, FINAL_REVIEW and traceability updated with official numbers and unmet targets
- docs/CollegeName_TeamName_Submission.pptx on the official template (team fields to fill)
- docs/LangAI3.0_AI_Disclosure.docx refreshed; generator scripts kept in scripts/
</commit_message>
<xml_diff>
--- a/docs/LangAI3.0_AI_Disclosure.docx
+++ b/docs/LangAI3.0_AI_Disclosure.docx
@@ -194,7 +194,7 @@
         <w:t>Testing / debugging</w:t>
       </w:r>
       <w:r>
-        <w:t xml:space="preserve"> Yes: Claude Code wrote 368 offline tests (unit, integration, regression, adversarial) and fixed the issues found by a hostile review (HARDENING_REPORT.md).</w:t>
+        <w:t xml:space="preserve"> Yes: Claude Code wrote 390 offline tests (unit, integration, regression, adversarial) and fixed the issues found by a hostile review (HARDENING_REPORT.md).</w:t>
       </w:r>
     </w:p>
     <w:p>
@@ -361,7 +361,7 @@
     </w:p>
     <w:p>
       <w:r>
-        <w:t xml:space="preserve">    Description (AI tools/platform used, prompt used, output summary, modification): Synthetic development fixture (data/dev_fixtures, marked NOT OFFICIAL) and held-out paraphrases were generated with LLMs (Claude Code; Gemini / gpt-oss for paraphrases). The official starter data (data/official) was provided by the organisers and is not AI-generated by the team.</w:t>
+        <w:t xml:space="preserve">    Description (AI tools/platform used, prompt used, output summary, modification): Synthetic development fixture (data/dev_fixtures, marked NOT OFFICIAL) and held-out paraphrases were generated with LLMs (Claude Code for the fixture; Gemini, qwen3.8-27b and gpt-oss-20b for paraphrases). The official starter data (data/official) was provided by the organisers and is not AI-generated by the team.</w:t>
       </w:r>
       <w:proofErr w:type="gramStart"/>
       <w:proofErr w:type="gramEnd"/>

</xml_diff>

<commit_message>
Re-run the official evaluation with Gemini (default provider)
- Pre-warmed plans and benchmark on gemini-3.1-flash-lite: every cold request served by the primary model
- results.jsonl, metrics.md, stress report, README, FINAL_REVIEW, traceability and AI disclosure updated
- Earlier Groq run archived in artifacts/reports/official_groq/
- Submission deck and disclosure form regenerated with the Gemini numbers and a new demo screenshot
</commit_message>
<xml_diff>
--- a/docs/LangAI3.0_AI_Disclosure.docx
+++ b/docs/LangAI3.0_AI_Disclosure.docx
@@ -91,7 +91,7 @@
     </w:p>
     <w:p>
       <w:r>
-        <w:t>Yes. AI was used in two ways. (a) Development: the code, tests, evaluation scripts, documentation, synthetic development data, presentation and demo video were produced with Claude Code (Anthropic's agentic coding assistant), working under the team's direction and specification; the team reviewed the work, ran it and made the design decisions. (b) Inside the product: a large language model (Groq openai/gpt-oss-120b for extraction, openai/gpt-oss-20b for query variations; Google Gemini also supported) reads the SIIS reference text, and a local BAAI/bge-small-en-v1.5 embedding model powers retrieval and the semantic cache. Code, not the model, enforces every hard rule (grounding, catalog-only deeplinks, URL scrubbing, ordering, schema).</w:t>
+        <w:t>Yes. AI was used in two ways. (a) Development: the code, tests, evaluation scripts, documentation, synthetic development data, presentation and demo video were produced with Claude Code (Anthropic's agentic coding assistant), working under the team's direction and specification; the team reviewed the work, ran it and made the design decisions. (b) Inside the product: a large language model (Google Gemini gemini-3.1-flash-lite for extraction and query variations; Groq openai/gpt-oss-120b also supported) reads the SIIS reference text, and a local BAAI/bge-small-en-v1.5 embedding model powers retrieval and the semantic cache. Code, not the model, enforces every hard rule (grounding, catalog-only deeplinks, URL scrubbing, ordering, schema).</w:t>
       </w:r>
     </w:p>
     <w:p/>
@@ -271,7 +271,7 @@
     </w:p>
     <w:p>
       <w:r>
-        <w:t xml:space="preserve">    Description (AI tools/platform used, prompt used, output summary, modification): Runtime LLM: Groq openai/gpt-oss-120b with a strict JSON schema. Prompt: the extraction rules in app/llm/prompts.py (use only the SOURCE, one action per screen, imperative steps). Code written by Claude Code; a deterministic grounding check removes any step not found in the SIIS text.</w:t>
+        <w:t xml:space="preserve">    Description (AI tools/platform used, prompt used, output summary, modification): Runtime LLM: Google Gemini gemini-3.1-flash-lite (Groq openai/gpt-oss-120b also supported) with a strict JSON schema. Prompt: the extraction rules in app/llm/prompts.py (use only the SOURCE, one action per screen, imperative steps). Code written by Claude Code; a deterministic grounding check removes any step not found in the SIIS text.</w:t>
       </w:r>
       <w:proofErr w:type="gramStart"/>
       <w:proofErr w:type="gramEnd"/>

</xml_diff>

<commit_message>
Add team details (ResolveAI, VITV) to the deck, disclosure form and README
</commit_message>
<xml_diff>
--- a/docs/LangAI3.0_AI_Disclosure.docx
+++ b/docs/LangAI3.0_AI_Disclosure.docx
@@ -35,10 +35,7 @@
         <w:t>Team Name:</w:t>
       </w:r>
       <w:r>
-        <w:rPr>
-          <w:highlight w:val="yellow"/>
-        </w:rPr>
-        <w:t xml:space="preserve"> [TO FILL: team name]</w:t>
+        <w:t xml:space="preserve"> ResolveAI</w:t>
       </w:r>
     </w:p>
     <w:p>
@@ -54,10 +51,7 @@
         <w:t>Organization / Institution (if any):</w:t>
       </w:r>
       <w:r>
-        <w:rPr>
-          <w:highlight w:val="yellow"/>
-        </w:rPr>
-        <w:t xml:space="preserve"> [TO FILL: college / institution]</w:t>
+        <w:t xml:space="preserve"> VITV</w:t>
       </w:r>
     </w:p>
     <w:p>

</xml_diff>

<commit_message>
AI disclosure: describe the team's role and where AI was used, feature by feature
</commit_message>
<xml_diff>
--- a/docs/LangAI3.0_AI_Disclosure.docx
+++ b/docs/LangAI3.0_AI_Disclosure.docx
@@ -85,7 +85,7 @@
     </w:p>
     <w:p>
       <w:r>
-        <w:t>Yes. AI was used in two ways. (a) Development: the code, tests, evaluation scripts, documentation, synthetic development data, presentation and demo video were produced with Claude Code (Anthropic's agentic coding assistant), working under the team's direction and specification; the team reviewed the work, ran it and made the design decisions. (b) Inside the product: a large language model (Google Gemini gemini-3.1-flash-lite for extraction and query variations; Groq openai/gpt-oss-120b also supported) reads the SIIS reference text, and a local BAAI/bge-small-en-v1.5 embedding model powers retrieval and the semantic cache. Code, not the model, enforces every hard rule (grounding, catalog-only deeplinks, URL scrubbing, ordering, schema).</w:t>
+        <w:t>Yes. (a) Development: team ResolveAI analysed the problem, wrote the detailed build specification (pipeline stages, hard rules, latency and accuracy targets, hardening and traceability requirements), made the design and model decisions, integrated the official data, reviewed and tested the system and prepared the deliverables. An AI coding assistant, Claude Code (Anthropic), generated most of the implementation (code, tests, evaluation scripts and documentation drafts) from that specification, under the team's direction. (b) Inside the product: a large language model (Google Gemini gemini-3.1-flash-lite; Groq openai/gpt-oss-120b also supported) reads the SIIS reference text, and a local BAAI/bge-small-en-v1.5 embedding model powers retrieval and the semantic cache. Code, not the model, enforces every hard rule (grounding, catalog-only deeplinks, URL scrubbing, ordering, schema).</w:t>
       </w:r>
     </w:p>
     <w:p/>
@@ -148,7 +148,7 @@
       </w:r>
       <w:proofErr w:type="gramEnd"/>
       <w:r>
-        <w:t xml:space="preserve"> Yes: Claude Code proposed the pipeline design (deterministic gates around a model-assisted extraction step) from the team's problem statement; the team chose the approach.</w:t>
+        <w:t xml:space="preserve"> Team-led: the team defined the approach (model assists, deterministic code decides) in its specification; Claude Code was used to discuss and refine design options.</w:t>
       </w:r>
     </w:p>
     <w:p>
@@ -156,7 +156,7 @@
         <w:t>Code generation or assistance</w:t>
       </w:r>
       <w:r>
-        <w:t xml:space="preserve"> Yes: most of the Python code (FastAPI service, retrieval, extraction, mapping, validation, caching) was generated by Claude Code and reviewed by the team.</w:t>
+        <w:t xml:space="preserve"> Yes: Claude Code generated most of the Python code (FastAPI service, retrieval, extraction, mapping, validation, caching) from the team's specification; the team reviewed, ran and corrected it.</w:t>
       </w:r>
     </w:p>
     <w:p>
@@ -164,7 +164,7 @@
         <w:t>UI / UX design</w:t>
       </w:r>
       <w:r>
-        <w:t xml:space="preserve"> Yes: the /demo web page was generated by Claude Code.</w:t>
+        <w:t xml:space="preserve"> Yes: the /demo web page was generated by Claude Code to the team's requirements.</w:t>
       </w:r>
     </w:p>
     <w:p>
@@ -172,7 +172,7 @@
         <w:t>Content creation</w:t>
       </w:r>
       <w:r>
-        <w:t xml:space="preserve"> Yes: README, metrics report, hardening report, traceability matrix, this presentation and the demo video were drafted by Claude Code; every number in them is rendered from measured reports.</w:t>
+        <w:t xml:space="preserve"> Yes: Claude Code drafted the README, reports and first version of the slides from the measured results; the team reviewed and finalised them and recorded the demo video.</w:t>
       </w:r>
     </w:p>
     <w:p>
@@ -180,7 +180,7 @@
         <w:t>Data analysis</w:t>
       </w:r>
       <w:r>
-        <w:t xml:space="preserve"> Yes: evaluation scripts written with Claude Code measure accuracy, latency, cost and cache hit rate against a live model; the analysis of the results was AI-assisted.</w:t>
+        <w:t xml:space="preserve"> Yes: Claude Code wrote the evaluation scripts; the team decided what to measure, when to re-run on the official data, and which trade-offs to accept.</w:t>
       </w:r>
     </w:p>
     <w:p>
@@ -188,7 +188,7 @@
         <w:t>Testing / debugging</w:t>
       </w:r>
       <w:r>
-        <w:t xml:space="preserve"> Yes: Claude Code wrote 390 offline tests (unit, integration, regression, adversarial) and fixed the issues found by a hostile review (HARDENING_REPORT.md).</w:t>
+        <w:t xml:space="preserve"> Yes: Claude Code wrote the 391 offline tests; the team tested the system on its own machines and reported issues that were then fixed (HARDENING_REPORT.md).</w:t>
       </w:r>
     </w:p>
     <w:p>
@@ -247,7 +247,7 @@
     </w:p>
     <w:p>
       <w:r>
-        <w:t xml:space="preserve">    Description (AI tools/platform used, prompt used, output summary, modification): Claude Code (Anthropic) generated the code from the team's specification prompt (problem statement, latency and accuracy targets). Output: domain lexicon, canonical intent, exact + embedding cache with concept and qualifier gates. The team set the targets; the cache threshold was calibrated by a script, not by hand.</w:t>
+        <w:t xml:space="preserve">    Description (AI tools/platform used, prompt used, output summary, modification): Team: specified the cache behaviour, latency target (P95 &lt;= 300 ms) and the rule that a wrong plan is worse than a miss. AI (Claude Code): generated the lexicon, canonical intent and exact + embedding cache code. The cache threshold was calibrated by a script, not by hand.</w:t>
       </w:r>
       <w:proofErr w:type="gramStart"/>
       <w:proofErr w:type="gramEnd"/>
@@ -265,7 +265,7 @@
     </w:p>
     <w:p>
       <w:r>
-        <w:t xml:space="preserve">    Description (AI tools/platform used, prompt used, output summary, modification): Runtime LLM: Google Gemini gemini-3.1-flash-lite (Groq openai/gpt-oss-120b also supported) with a strict JSON schema. Prompt: the extraction rules in app/llm/prompts.py (use only the SOURCE, one action per screen, imperative steps). Code written by Claude Code; a deterministic grounding check removes any step not found in the SIIS text.</w:t>
+        <w:t xml:space="preserve">    Description (AI tools/platform used, prompt used, output summary, modification): Team: defined the extraction rules (use only the SIIS text, one action per screen, imperative steps) and chose the runtime models. AI: Claude Code generated the code and prompt (app/llm/prompts.py); at run time Google Gemini gemini-3.1-flash-lite extracts with a strict JSON schema, and a grounding check removes any step not found in the SIIS text.</w:t>
       </w:r>
       <w:proofErr w:type="gramStart"/>
       <w:proofErr w:type="gramEnd"/>
@@ -283,7 +283,7 @@
     </w:p>
     <w:p>
       <w:r>
-        <w:t xml:space="preserve">    Description (AI tools/platform used, prompt used, output summary, modification): Code generated by Claude Code. No LLM picks URIs: the URI is always copied from the catalog. An LLM-based mapper exists only as an ablation baseline. Adapted by the team's direction to the official catalog format.</w:t>
+        <w:t xml:space="preserve">    Description (AI tools/platform used, prompt used, output summary, modification): Team: required that URIs are only ever copied from the catalog, and directed the adaptation to the official voiceassist:// catalog. AI: Claude Code generated the retrieval and resolver code. An LLM-based mapper exists only as an ablation baseline.</w:t>
       </w:r>
       <w:proofErr w:type="gramStart"/>
       <w:proofErr w:type="gramEnd"/>
@@ -301,7 +301,7 @@
     </w:p>
     <w:p>
       <w:r>
-        <w:t xml:space="preserve">    Description (AI tools/platform used, prompt used, output summary, modification): Code generated by Claude Code from the schema.py contract and the hackathon rules: schema validation, business rules, URL and prompt-injection scrubbing, critical-last ordering. Verified by adversarial tests.</w:t>
+        <w:t xml:space="preserve">    Description (AI tools/platform used, prompt used, output summary, modification): Team: set the rules from the schema.py contract and the problem statement (no URLs, critical actions last, manual actions without links). AI: Claude Code generated the validators; verified by adversarial tests.</w:t>
       </w:r>
       <w:proofErr w:type="gramStart"/>
       <w:proofErr w:type="gramEnd"/>
@@ -319,7 +319,7 @@
     </w:p>
     <w:p>
       <w:r>
-        <w:t xml:space="preserve">    Description (AI tools/platform used, prompt used, output summary, modification): Scripts generated by Claude Code; they run the real HTTP server against a live model and render metrics.md from JSON. No figure was typed by hand.</w:t>
+        <w:t xml:space="preserve">    Description (AI tools/platform used, prompt used, output summary, modification): Team: decided what to measure and accepted only measured numbers, including targets not met. AI: Claude Code generated the scripts, which run a real HTTP server against a live model and render metrics.md from JSON.</w:t>
       </w:r>
       <w:proofErr w:type="gramStart"/>
       <w:proofErr w:type="gramEnd"/>
@@ -337,7 +337,7 @@
     </w:p>
     <w:p>
       <w:r>
-        <w:t xml:space="preserve">    Description (AI tools/platform used, prompt used, output summary, modification): Generated with Claude Code (HTML page, python-pptx/pptxgenjs deck, Playwright-recorded browser video) from the measured reports; team details are filled in by the team.</w:t>
+        <w:t xml:space="preserve">    Description (AI tools/platform used, prompt used, output summary, modification): Team: reviewed and finalised the presentation, filled the team details and recorded the demo video (https://youtu.be/eRBRi4PisPU). AI: Claude Code generated the /demo page, the first version of the slides from the measured reports and an earlier API walkthrough video (docs/demo.webm).</w:t>
       </w:r>
       <w:proofErr w:type="gramStart"/>
       <w:proofErr w:type="gramEnd"/>

</xml_diff>